<commit_message>
LibrarySystem with EFCore and 3Tier
</commit_message>
<xml_diff>
--- a/14-05-2026/Case Study.docx
+++ b/14-05-2026/Case Study.docx
@@ -269,13 +269,11 @@
       </w:r>
       <w:r>
         <w:tab/>
-        <w:t xml:space="preserve">Mark a book copy as damaged or </w:t>
-      </w:r>
-      <w:proofErr w:type="spellStart"/>
-      <w:r>
-        <w:t>unavailabl</w:t>
-      </w:r>
-      <w:proofErr w:type="spellEnd"/>
+        <w:t>Mark a book copy as damaged or unavailabl</w:t>
+      </w:r>
+      <w:r>
+        <w:t>e</w:t>
+      </w:r>
     </w:p>
     <w:p>
       <w:r>

</xml_diff>